<commit_message>
Add executive presentation speech in Word and header/footer on Fase 4 docs
Co-Authored-By: Claude Sonnet 5.5 <noreply@anthropic.com>
Claude-Session: https://claude.ai/code/session_019R7fznGAuNRyygQM6ARvPY
</commit_message>
<xml_diff>
--- a/fase4/Fase4_Rediseno_Validacion_Cambio.docx
+++ b/fase4/Fase4_Rediseno_Validacion_Cambio.docx
@@ -4575,6 +4575,8 @@
     </w:tbl>
     <w:p/>
     <w:sectPr>
+      <w:headerReference w:type="default" r:id="rId12"/>
+      <w:footerReference w:type="default" r:id="rId13"/>
       <w:pgSz w:w="12240" w:h="15840"/>
       <w:pgMar w:top="1152" w:right="1296" w:bottom="1152" w:left="1296" w:header="720" w:footer="720" w:gutter="0"/>
       <w:cols w:space="720"/>
@@ -4582,6 +4584,50 @@
     </w:sectPr>
   </w:body>
 </w:document>
+</file>
+
+<file path=word/footer1.xml><?xml version="1.0" encoding="utf-8"?>
+<w:ftr xmlns:m="http://schemas.openxmlformats.org/officeDocument/2006/math" xmlns:mc="http://schemas.openxmlformats.org/markup-compatibility/2006" xmlns:mo="http://schemas.microsoft.com/office/mac/office/2008/main" xmlns:mv="urn:schemas-microsoft-com:mac:vml" xmlns:o="urn:schemas-microsoft-com:office:office" xmlns:r="http://schemas.openxmlformats.org/officeDocument/2006/relationships" xmlns:v="urn:schemas-microsoft-com:vml" xmlns:w10="urn:schemas-microsoft-com:office:word" xmlns:w14="http://schemas.microsoft.com/office/word/2010/wordml" xmlns:w="http://schemas.openxmlformats.org/wordprocessingml/2006/main" xmlns:wne="http://schemas.microsoft.com/office/word/2006/wordml" xmlns:wp14="http://schemas.microsoft.com/office/word/2010/wordprocessingDrawing" xmlns:wp="http://schemas.openxmlformats.org/drawingml/2006/wordprocessingDrawing" xmlns:wpc="http://schemas.microsoft.com/office/word/2010/wordprocessingCanvas" xmlns:wpg="http://schemas.microsoft.com/office/word/2010/wordprocessingGroup" xmlns:wpi="http://schemas.microsoft.com/office/word/2010/wordprocessingInk" xmlns:wps="http://schemas.microsoft.com/office/word/2010/wordprocessingShape" mc:Ignorable="w14 wp14">
+  <w:p>
+    <w:pPr>
+      <w:pStyle w:val="Footer"/>
+      <w:jc w:val="center"/>
+    </w:pPr>
+    <w:r>
+      <w:rPr>
+        <w:sz w:val="18"/>
+      </w:rPr>
+      <w:t xml:space="preserve">pág. </w:t>
+    </w:r>
+    <w:r>
+      <w:rPr>
+        <w:sz w:val="18"/>
+      </w:rPr>
+      <w:fldChar w:fldCharType="begin"/>
+      <w:instrText xml:space="preserve"> PAGE </w:instrText>
+      <w:fldChar w:fldCharType="end"/>
+    </w:r>
+  </w:p>
+</w:ftr>
+</file>
+
+<file path=word/header1.xml><?xml version="1.0" encoding="utf-8"?>
+<w:hdr xmlns:m="http://schemas.openxmlformats.org/officeDocument/2006/math" xmlns:mc="http://schemas.openxmlformats.org/markup-compatibility/2006" xmlns:mo="http://schemas.microsoft.com/office/mac/office/2008/main" xmlns:mv="urn:schemas-microsoft-com:mac:vml" xmlns:o="urn:schemas-microsoft-com:office:office" xmlns:r="http://schemas.openxmlformats.org/officeDocument/2006/relationships" xmlns:v="urn:schemas-microsoft-com:vml" xmlns:w10="urn:schemas-microsoft-com:office:word" xmlns:w14="http://schemas.microsoft.com/office/word/2010/wordml" xmlns:w="http://schemas.openxmlformats.org/wordprocessingml/2006/main" xmlns:wne="http://schemas.microsoft.com/office/word/2006/wordml" xmlns:wp14="http://schemas.microsoft.com/office/word/2010/wordprocessingDrawing" xmlns:wp="http://schemas.openxmlformats.org/drawingml/2006/wordprocessingDrawing" xmlns:wpc="http://schemas.microsoft.com/office/word/2010/wordprocessingCanvas" xmlns:wpg="http://schemas.microsoft.com/office/word/2010/wordprocessingGroup" xmlns:wpi="http://schemas.microsoft.com/office/word/2010/wordprocessingInk" xmlns:wps="http://schemas.microsoft.com/office/word/2010/wordprocessingShape" mc:Ignorable="w14 wp14">
+  <w:p>
+    <w:pPr>
+      <w:pStyle w:val="Header"/>
+      <w:jc w:val="right"/>
+    </w:pPr>
+    <w:r>
+      <w:rPr>
+        <w:b/>
+        <w:color w:val="1F3A5F"/>
+        <w:sz w:val="20"/>
+      </w:rPr>
+      <w:t>TECMILENIO</w:t>
+    </w:r>
+  </w:p>
+</w:hdr>
 </file>
 
 <file path=word/numbering.xml><?xml version="1.0" encoding="utf-8"?>

</xml_diff>

<commit_message>
Replace process diagrams with swimlane AS-IS/TO-BE (steps, time, owner, resources, sequence)
Co-Authored-By: Claude Sonnet 5.5 <noreply@anthropic.com>
Claude-Session: https://claude.ai/code/session_019R7fznGAuNRyygQM6ARvPY
</commit_message>
<xml_diff>
--- a/fase4/Fase4_Rediseno_Validacion_Cambio.docx
+++ b/fase4/Fase4_Rediseno_Validacion_Cambio.docx
@@ -158,7 +158,7 @@
       <w:r>
         <w:drawing>
           <wp:inline xmlns:a="http://schemas.openxmlformats.org/drawingml/2006/main" xmlns:pic="http://schemas.openxmlformats.org/drawingml/2006/picture">
-            <wp:extent cx="6126480" cy="3165348"/>
+            <wp:extent cx="6126480" cy="2870763"/>
             <wp:docPr id="1" name="Picture 1"/>
             <wp:cNvGraphicFramePr>
               <a:graphicFrameLocks noChangeAspect="1"/>
@@ -167,7 +167,7 @@
               <a:graphicData uri="http://schemas.openxmlformats.org/drawingml/2006/picture">
                 <pic:pic>
                   <pic:nvPicPr>
-                    <pic:cNvPr id="0" name="diagrama_asis.png"/>
+                    <pic:cNvPr id="0" name="swim_asis.png"/>
                     <pic:cNvPicPr/>
                   </pic:nvPicPr>
                   <pic:blipFill>
@@ -179,7 +179,7 @@
                   <pic:spPr>
                     <a:xfrm>
                       <a:off x="0" y="0"/>
-                      <a:ext cx="6126480" cy="3165348"/>
+                      <a:ext cx="6126480" cy="2870763"/>
                     </a:xfrm>
                     <a:prstGeom prst="rect"/>
                   </pic:spPr>
@@ -1513,7 +1513,7 @@
       <w:r>
         <w:drawing>
           <wp:inline xmlns:a="http://schemas.openxmlformats.org/drawingml/2006/main" xmlns:pic="http://schemas.openxmlformats.org/drawingml/2006/picture">
-            <wp:extent cx="6126480" cy="3165348"/>
+            <wp:extent cx="6126480" cy="4995438"/>
             <wp:docPr id="3" name="Picture 3"/>
             <wp:cNvGraphicFramePr>
               <a:graphicFrameLocks noChangeAspect="1"/>
@@ -1522,7 +1522,7 @@
               <a:graphicData uri="http://schemas.openxmlformats.org/drawingml/2006/picture">
                 <pic:pic>
                   <pic:nvPicPr>
-                    <pic:cNvPr id="0" name="diagrama_tobe.png"/>
+                    <pic:cNvPr id="0" name="swim_tobe.png"/>
                     <pic:cNvPicPr/>
                   </pic:nvPicPr>
                   <pic:blipFill>
@@ -1534,7 +1534,7 @@
                   <pic:spPr>
                     <a:xfrm>
                       <a:off x="0" y="0"/>
-                      <a:ext cx="6126480" cy="3165348"/>
+                      <a:ext cx="6126480" cy="4995438"/>
                     </a:xfrm>
                     <a:prstGeom prst="rect"/>
                   </pic:spPr>

</xml_diff>